<commit_message>
feat: add 2_TANGGAPAN_2.docx template for KKPRNB documentation
</commit_message>
<xml_diff>
--- a/public/templates/kkprnb/2_TANGGAPAN_2.docx
+++ b/public/templates/kkprnb/2_TANGGAPAN_2.docx
@@ -2005,7 +2005,19 @@
               <w:rPr>
                 <w:rFonts w:ascii="Times New Roman" w:hAnsi="Times New Roman" w:cs="Times New Roman"/>
               </w:rPr>
-              <w:t>Penata Perizinan Ahli Madya</w:t>
+              <w:t>Penata Peri</w:t>
+            </w:r>
+            <w:r>
+              <w:rPr>
+                <w:rFonts w:ascii="Times New Roman" w:hAnsi="Times New Roman" w:cs="Times New Roman"/>
+              </w:rPr>
+              <w:t>j</w:t>
+            </w:r>
+            <w:r>
+              <w:rPr>
+                <w:rFonts w:ascii="Times New Roman" w:hAnsi="Times New Roman" w:cs="Times New Roman"/>
+              </w:rPr>
+              <w:t>inan Ahli Madya</w:t>
             </w:r>
           </w:p>
         </w:tc>

</xml_diff>